<commit_message>
Génération des actes de congé ainsi que la génération en pdf correction de quelques erreurs ajout de la section signer au niveau du dashboard
</commit_message>
<xml_diff>
--- a/backend/templates/word/autorisation_conge_template.docx
+++ b/backend/templates/word/autorisation_conge_template.docx
@@ -378,39 +378,16 @@
           <w:sz w:val="26"/>
           <w:szCs w:val="26"/>
         </w:rPr>
-        <w:t>{{AGENT_NOM_COMPLET}}</w:t>
-      </w:r>
-      <w:r>
-        <w:rPr>
-          <w:rFonts w:ascii="Trebuchet MS" w:hAnsi="Trebuchet MS"/>
-          <w:sz w:val="26"/>
-          <w:szCs w:val="26"/>
-        </w:rPr>
-        <w:t>, S</w:t>
-      </w:r>
-      <w:r>
-        <w:rPr>
-          <w:rFonts w:ascii="Trebuchet MS" w:hAnsi="Trebuchet MS"/>
-          <w:sz w:val="26"/>
-          <w:szCs w:val="26"/>
-        </w:rPr>
-        <w:t>ecrétaire</w:t>
-      </w:r>
-      <w:r>
-        <w:rPr>
-          <w:rFonts w:ascii="Trebuchet MS" w:hAnsi="Trebuchet MS"/>
-          <w:sz w:val="26"/>
-          <w:szCs w:val="26"/>
-        </w:rPr>
-        <w:t xml:space="preserve"> Adjoint</w:t>
-      </w:r>
-      <w:r>
-        <w:rPr>
-          <w:rFonts w:ascii="Trebuchet MS" w:hAnsi="Trebuchet MS"/>
-          <w:sz w:val="26"/>
-          <w:szCs w:val="26"/>
-        </w:rPr>
-        <w:t xml:space="preserve"> des Services Administratifs</w:t>
+        <w:t>{{AGENT_NOM}}</w:t>
+      </w:r>
+      <w:r>
+        <w:rPr>
+          <w:rFonts w:ascii="Trebuchet MS" w:eastAsia="Times New Roman" w:hAnsi="Trebuchet MS" w:cs="Arial"/>
+          <w:b/>
+          <w:sz w:val="26"/>
+          <w:szCs w:val="26"/>
+        </w:rPr>
+        <w:t xml:space="preserve"> {{AGENT_PRENOM</w:t>
       </w:r>
       <w:r>
         <w:rPr>
@@ -421,6 +398,16 @@
           <w:szCs w:val="26"/>
         </w:rPr>
         <w:t>,</w:t>
+      </w:r>
+      <w:r>
+        <w:rPr>
+          <w:rFonts w:ascii="Trebuchet MS" w:hAnsi="Trebuchet MS"/>
+          <w:bCs/>
+          <w:iCs/>
+          <w:sz w:val="26"/>
+          <w:szCs w:val="26"/>
+        </w:rPr>
+        <w:t>{{AGENT_POSTE}}</w:t>
       </w:r>
       <w:r>
         <w:rPr>
@@ -1767,7 +1754,7 @@
                                     </pic:cNvPicPr>
                                   </pic:nvPicPr>
                                   <pic:blipFill>
-                                    <a:blip r:embed="rId1">
+                                    <a:blip r:embed="rId3">
                                       <a:extLst>
                                         <a:ext uri="{28A0092B-C50C-407E-A947-70E740481C1C}">
                                           <a14:useLocalDpi xmlns:a14="http://schemas.microsoft.com/office/drawing/2010/main" val="0"/>
@@ -1874,7 +1861,7 @@
                   <o:lock v:ext="edit" aspectratio="t"/>
                 </v:shapetype>
                 <v:shape id="Image 10" o:spid="_x0000_s1031" type="#_x0000_t75" alt="Description : G:\DIP2016\charte\armoirie-Benin.png" style="position:absolute;left:-231;top:-499;width:7715;height:6476;visibility:visible;mso-wrap-style:square" o:gfxdata="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">
-                  <v:imagedata r:id="rId3" o:title="armoirie-Benin"/>
+                  <v:imagedata r:id="rId4" o:title="armoirie-Benin"/>
                   <v:path arrowok="t"/>
                   <o:lock v:ext="edit" aspectratio="f"/>
                 </v:shape>

</xml_diff>